<commit_message>
Dodaj Adrianu na stol 50
</commit_message>
<xml_diff>
--- a/stolovipopis/Stol 50.docx
+++ b/stolovipopis/Stol 50.docx
@@ -218,6 +218,24 @@
           <w:lang w:val="hr-BA"/>
         </w:rPr>
         <w:t xml:space="preserve">Jurić Ivan (Antin)</w:t>
+      </w:r>
+    </w:p>
+    <w:p>
+      <w:pPr>
+        <w:pStyle w:val="Listenabsatz"/>
+        <w:numPr>
+          <w:ilvl w:val="0"/>
+          <w:numId w:val="1"/>
+        </w:numPr>
+        <w:rPr>
+          <w:lang w:val="hr-BA"/>
+        </w:rPr>
+      </w:pPr>
+      <w:r>
+        <w:rPr>
+          <w:lang w:val="hr-BA"/>
+        </w:rPr>
+        <w:t>Veselčić Adriana</w:t>
       </w:r>
     </w:p>
     <w:sectPr>

</xml_diff>